<commit_message>
Update PAWSIC-Committee-Operating-Policy.docx per Jeanine: no fixed meeting length; committee eligibility = Premium + Students + waivable free members (CNAs)
</commit_message>
<xml_diff>
--- a/governance/PAWSIC-Committee-Operating-Policy.docx
+++ b/governance/PAWSIC-Committee-Operating-Policy.docx
@@ -301,27 +301,7 @@
           <w:sz w:val="21"/>
           <w:szCs w:val="21"/>
         </w:rPr>
-        <w:t xml:space="preserve">Meetings run for </w:t>
-      </w:r>
-      <w:r>
-        <w:rPr>
-          <w:rFonts w:ascii="Calibri" w:cs="Calibri" w:eastAsia="Calibri" w:hAnsi="Calibri"/>
-          <w:b/>
-          <w:bCs/>
-          <w:color w:val="0C1F3F"/>
-          <w:sz w:val="21"/>
-          <w:szCs w:val="21"/>
-        </w:rPr>
-        <w:t xml:space="preserve">[60 minutes]</w:t>
-      </w:r>
-      <w:r>
-        <w:rPr>
-          <w:rFonts w:ascii="Calibri" w:cs="Calibri" w:eastAsia="Calibri" w:hAnsi="Calibri"/>
-          <w:color w:val="2D3748"/>
-          <w:sz w:val="21"/>
-          <w:szCs w:val="21"/>
-        </w:rPr>
-        <w:t xml:space="preserve"> unless the Chair extends the time in advance.</w:t>
+        <w:t xml:space="preserve">The Chair sets each meeting’s length in advance based on the agenda; some meetings are brief, others run longer.</w:t>
       </w:r>
     </w:p>
     <w:p>

</xml_diff>